<commit_message>
Study 1 manuscript: correct deferral counts, temperature statement, wording
Co-Authored-By: Claude Sonnet 5.5 <noreply@anthropic.com>
Claude-Session: https://claude.ai/code/session_013HycsBHnRQDCEHKmLM3Rd4
</commit_message>
<xml_diff>
--- a/study1/Study1_results_v1.docx
+++ b/study1/Study1_results_v1.docx
@@ -138,7 +138,7 @@
           <w:sz w:val="24"/>
           <w:szCs w:val="24"/>
         </w:rPr>
-        <w:t xml:space="preserve">This paper reports a test of that account on a four-tier ladder from one commercial model family. We state three hypotheses before data collection, run the registered collection for the commercial ladder, and report what the data can and cannot say. The main finding is a limit of the test and not a scale effect: normative consistency was at ceiling in every tier and deference was close to floor, so the registered hypotheses about direction could not be adjudicated. We report this plainly because the result is informative in two ways. It shows that, for this family and this kind of task, the problem the procurement heuristic worries about is rare. And it shows what a test with power would require.</w:t>
+        <w:t xml:space="preserve">This paper reports a test of that account on a four-tier ladder from one commercial model family. We state three hypotheses before data collection, run the commercial-ladder part of the registered collection, and report what the data can and cannot say. The main finding is a limit of the test and not a scale effect: normative consistency was at ceiling in every tier and deference was close to floor, so the registered hypotheses about direction could not be adjudicated. We report this plainly because the result is informative in two ways. It shows that, for this family and this kind of task, the problem the procurement heuristic worries about is rare. And it shows what a test with power would require.</w:t>
       </w:r>
     </w:p>
     <w:p>
@@ -455,7 +455,7 @@
           <w:sz w:val="24"/>
           <w:szCs w:val="24"/>
         </w:rPr>
-        <w:t xml:space="preserve">Size is not randomly assigned. Identification rests on within-family contrasts, the tightest comparison the public checkpoint market allows. Larger checkpoints may receive additional post-training, and commercial tier labels are advertised orderings and not disclosed parameter counts. We therefore speak of tiers and not of parameter counts. The ladder is one commercial family accessed through the provider’s programming interface: Haiku 4.5 (Small), Sonnet 5.5 (Mid), Opus 5.5 (Large), and Fable 5.1 (XLarge). Each tier was queried once per query, with the same system prompt and item order.</w:t>
+        <w:t xml:space="preserve">Size is not randomly assigned. Identification rests on within-family contrasts, the tightest comparison the public checkpoint market allows. Larger checkpoints may receive additional post-training, and commercial tier labels are advertised orderings and not disclosed parameter counts. We therefore speak of tiers and not of parameter counts. The ladder is one commercial family accessed through the provider’s programming interface: Haiku 4.5 (Small), Sonnet 5.5 (Mid), Opus 5.5 (Large), and Fable 5.1 (XLarge). One completion was drawn per query, with the same system prompt and item order for every tier.</w:t>
       </w:r>
     </w:p>
     <w:p>
@@ -470,7 +470,7 @@
           <w:sz w:val="24"/>
           <w:szCs w:val="24"/>
         </w:rPr>
-        <w:t xml:space="preserve">Two features of this ladder confound scale with other properties and must accompany every result from it. According to the provider’s documentation at the time of collection, the Sonnet, Opus, and Fable tiers do not accept a temperature argument, so they were not run at temperature zero, whereas the Haiku tier accepts it; the tiers may also differ in whether they reason before answering. Scale in this ladder is therefore confounded with sampling control and possibly with reasoning. We treat the ladder as the evidence a procurement decision would face. The registered design placed the open-weight panel, with decoding held fixed, as the cleaner test of the mechanism. That panel (Qwen2.5-Instruct, Llama-3.1-Instruct, Gemma-2-Instruct, and Qwen3) was not run for this report, so the cleaner test is missing, and the conclusions below are limited to this family.</w:t>
+        <w:t xml:space="preserve">Two features of this ladder confound scale with other properties and must accompany every result from it. According to the provider’s documentation, the Sonnet and Opus tiers reject a temperature argument, so they were not run at temperature zero, whereas the Haiku tier accepts it; whether a temperature was applied is recorded for every row in the logs and reported in the replication package, and the tiers may also differ in whether they reason before answering. Scale in this ladder is therefore confounded with sampling control and possibly with reasoning. We treat the ladder as the evidence a procurement decision would face. The registered design placed the open-weight panel, with decoding held fixed, as the cleaner test of the mechanism. That panel (Qwen2.5-Instruct, Llama-3.1-Instruct, Gemma-2-Instruct, and Qwen3) was not run for this report, so the cleaner test is missing, and the conclusions below are limited to this family.</w:t>
       </w:r>
     </w:p>
     <w:p>
@@ -4254,7 +4254,7 @@
           <w:sz w:val="24"/>
           <w:szCs w:val="24"/>
         </w:rPr>
-        <w:t xml:space="preserve">The CorrectSocial difference is not a deference effect. Because RS was nearly zero in every tier, the stance-channel answers that were neither gold nor unsupported must account for it: Haiku chose the third option on 10 of 120 stance-bearing stems (8.3%), obtained from 120 minus 107 gold answers minus 3 unsupported answers, whereas Sonnet and Opus did not choose it at all and Fable did so on at most one stem, the one that failed to parse. The smallest tier is therefore distinguished by occasionally declining to commit to either the evidence-supported or the stance-endorsed action, which is a different failure from deference and should not be read as a larger model being less swayed.</w:t>
+        <w:t xml:space="preserve">The CorrectSocial difference is not a deference effect. Because RS was nearly zero in every tier, the stance-channel answers that were neither gold nor unsupported must account for it: Haiku chose the third option on 10 of 120 stance-bearing stems (8.3%), obtained from 120 minus 107 gold answers minus 3 unsupported answers, whereas Sonnet and Opus did not choose it at all, and the single stance-channel answer from Fable that was neither gold nor unsupported was the row that failed to parse. The smallest tier is therefore distinguished by occasionally declining to commit to either the evidence-supported or the stance-endorsed action, which is a different failure from deference and should not be read as a larger model being less swayed.</w:t>
       </w:r>
     </w:p>
     <w:p>
@@ -5369,7 +5369,7 @@
           <w:sz w:val="24"/>
           <w:szCs w:val="24"/>
         </w:rPr>
-        <w:t xml:space="preserve">Table 5 reports deference by stance sentence for the Small, Mid, and Large tiers (30 stems per cell). The pattern is concentrated in one sentence. “The organization has already decided” produced three deferring answers in Mid and Large combined (0.100 and 0.067) and none in Small, whereas the other three sentences produced at most one deferring answer per cell, all in Small (0.033). The cell sizes are too small to treat this as a finding, but they raise the possibility that the stance sentence does not carry the same information in every form, which would weaken the assumption that the sentences are interchangeable.</w:t>
+        <w:t xml:space="preserve">Table 5 reports deference by stance sentence for the Small, Mid, and Large tiers (30 stems per cell). The pattern is concentrated in one sentence. “The organization has already decided” produced five deferring answers (three in Mid and two in Large; 0.100 and 0.067) and none in Small, whereas the other three sentences produced at most one deferring answer per cell, all in Small (0.033). The cell sizes are too small to treat this as a finding, but they raise the possibility that the stance sentence does not carry the same information in every form, which would weaken the assumption that the sentences are interchangeable.</w:t>
       </w:r>
     </w:p>
     <w:p>
@@ -6093,7 +6093,7 @@
           <w:sz w:val="20"/>
           <w:szCs w:val="20"/>
         </w:rPr>
-        <w:t xml:space="preserve"> 30 stems per cell. Fable is not shown in the registered by-sentence table and had no deferring answers.</w:t>
+        <w:t xml:space="preserve"> 30 stems per cell. The by-sentence analysis covers Small, Mid, and Large; Fable had no deferring answers in total.</w:t>
       </w:r>
     </w:p>
     <w:p>

</xml_diff>

<commit_message>
Study 1b: hard item bank, audit with independent re-solver, pilot gate, open-weight panel, registered plan
Co-Authored-By: Claude Sonnet 5.5 <noreply@anthropic.com>
Claude-Session: https://claude.ai/code/session_013HycsBHnRQDCEHKmLM3Rd4
</commit_message>
<xml_diff>
--- a/study1/Study1_results_v1.docx
+++ b/study1/Study1_results_v1.docx
@@ -470,7 +470,7 @@
           <w:sz w:val="24"/>
           <w:szCs w:val="24"/>
         </w:rPr>
-        <w:t xml:space="preserve">Two features of this ladder confound scale with other properties and must accompany every result from it. According to the provider’s documentation, the Sonnet and Opus tiers reject a temperature argument, so they were not run at temperature zero, whereas the Haiku tier accepts it; whether a temperature was applied is recorded for every row in the logs and reported in the replication package, and the tiers may also differ in whether they reason before answering. Scale in this ladder is therefore confounded with sampling control and possibly with reasoning. We treat the ladder as the evidence a procurement decision would face. The registered design placed the open-weight panel, with decoding held fixed, as the cleaner test of the mechanism. That panel (Qwen2.5-Instruct, Llama-3.1-Instruct, Gemma-2-Instruct, and Qwen3) was not run for this report, so the cleaner test is missing, and the conclusions below are limited to this family.</w:t>
+        <w:t xml:space="preserve">Two features of this ladder confound scale with other properties and must accompany every result from it. The runner omits the temperature argument for the Sonnet, Opus, and Fable tiers, which the provider’s documentation lists as rejecting it, so these tiers were not run at temperature zero, whereas the Haiku tier accepts it; whether a temperature was applied is recorded for every row in the logs and reported in the replication package, and the tiers may also differ in whether they reason before answering. Scale in this ladder is therefore confounded with sampling control and possibly with reasoning. We treat the ladder as the evidence a procurement decision would face. The registered design placed the open-weight panel, with decoding held fixed, as the cleaner test of the mechanism. That panel (Qwen2.5-Instruct, Llama-3.1-Instruct, Gemma-2-Instruct, and Qwen3) was not run for this report, so the cleaner test is missing, and the conclusions below are limited to this family.</w:t>
       </w:r>
     </w:p>
     <w:p>
@@ -6286,7 +6286,7 @@
           <w:sz w:val="24"/>
           <w:szCs w:val="24"/>
         </w:rPr>
-        <w:t xml:space="preserve">A replication with power needs outcome variance. Candidate changes, to be registered before collection, are harder items in which the evidence is partial or the stance supplies an uncheckable fact; multi-turn stance escalation; a pilot with a pre-specified ceiling and floor rule; and the open-weight panel, in which decoding is fixed and several sizes per family are available. The human-side experiment can be run independently of the model results, because its recommendations are fixed text. Field validation with an organization’s own decision logs would test whether deference measured on synthetic stems predicts deference in practice.</w:t>
+        <w:t xml:space="preserve">A replication with power needs outcome variance. Candidate changes, to be registered before collection, are harder items in which the evidence is partial or the stance supplies an uncheckable fact; multi-turn stance escalation; a pilot with a pre-specified ceiling and floor rule; and the open-weight panel, in which decoding is fixed and several sizes per family are available. The human-side experiment can be run independently of the model results, because its recommendations are fixed text. A registered follow-up with a harder item bank, stance sentences that assert claimed support, and an open-weight panel with several sizes per family has been prepared (plan, code, and a pilot gate are in the replication package) and has not been run. Field validation with an organization’s own decision logs would test whether deference measured on synthetic stems predicts deference in practice.</w:t>
       </w:r>
     </w:p>
     <w:p>

</xml_diff>